<commit_message>
Preview: boss win flow, home screen Figma assets, HUD fixes
- gameplay.html: victory VIBGYOR sparks, ship fly-out, Mission Complete overlay;
  wave intros, fodder scale, combat gates; ship/thruster scale alignment
- index.html: Figma 2154-410 local assets (ship, strike line, nav icons);
  logo above ship; single-line status; Battle CTA corners via absolute layer
- Assets: preview/assets/images/home/*; upgrade-pickup.png; remove upgrade_asset
- Docs: GDD, implementation-plan, phase-2 handoff, shooting reference,
  PREVIEW-GAMEPLAY, assets README, RUN.md; Phase 2 docx update

Made-with: Cursor
</commit_message>
<xml_diff>
--- a/Phase 2 implementation.docx
+++ b/Phase 2 implementation.docx
@@ -459,43 +459,7 @@
           <w:sz w:val="20"/>
           <w:szCs w:val="20"/>
         </w:rPr>
-        <w:t xml:space="preserve"> — </w:t>
-      </w:r>
-      <w:r>
-        <w:rPr>
-          <w:rFonts w:ascii="Arial" w:hAnsi="Arial" w:cs="Arial"/>
-          <w:color w:val="D8DEE9"/>
-          <w:sz w:val="20"/>
-          <w:szCs w:val="20"/>
-        </w:rPr>
-        <w:t>After entry they will come</w:t>
-      </w:r>
-      <w:r>
-        <w:rPr>
-          <w:rFonts w:ascii="Arial" w:hAnsi="Arial" w:cs="Arial"/>
-          <w:color w:val="D8DEE9"/>
-          <w:sz w:val="20"/>
-          <w:szCs w:val="20"/>
-        </w:rPr>
-        <w:t xml:space="preserve"> in</w:t>
-      </w:r>
-      <w:r>
-        <w:rPr>
-          <w:rFonts w:ascii="Arial" w:hAnsi="Arial" w:cs="Arial"/>
-          <w:color w:val="D8DEE9"/>
-          <w:sz w:val="20"/>
-          <w:szCs w:val="20"/>
-        </w:rPr>
-        <w:t>to</w:t>
-      </w:r>
-      <w:r>
-        <w:rPr>
-          <w:rFonts w:ascii="Arial" w:hAnsi="Arial" w:cs="Arial"/>
-          <w:color w:val="D8DEE9"/>
-          <w:sz w:val="20"/>
-          <w:szCs w:val="20"/>
-        </w:rPr>
-        <w:t xml:space="preserve"> formations (line, </w:t>
+        <w:t xml:space="preserve"> — After entry they will come into formations (line, </w:t>
       </w:r>
       <w:proofErr w:type="spellStart"/>
       <w:r>
@@ -505,16 +469,7 @@
           <w:sz w:val="20"/>
           <w:szCs w:val="20"/>
         </w:rPr>
-        <w:t>wedge</w:t>
-      </w:r>
-      <w:r>
-        <w:rPr>
-          <w:rFonts w:ascii="Arial" w:hAnsi="Arial" w:cs="Arial"/>
-          <w:color w:val="D8DEE9"/>
-          <w:sz w:val="20"/>
-          <w:szCs w:val="20"/>
-        </w:rPr>
-        <w:t>,grid</w:t>
+        <w:t>wedge,grid</w:t>
       </w:r>
       <w:proofErr w:type="spellEnd"/>
       <w:r>
@@ -561,16 +516,7 @@
           <w:sz w:val="20"/>
           <w:szCs w:val="20"/>
         </w:rPr>
-        <w:t> — Enemies can attack the player (projectiles, beams</w:t>
-      </w:r>
-      <w:r>
-        <w:rPr>
-          <w:rFonts w:ascii="Arial" w:hAnsi="Arial" w:cs="Arial"/>
-          <w:color w:val="D8DEE9"/>
-          <w:sz w:val="20"/>
-          <w:szCs w:val="20"/>
-        </w:rPr>
-        <w:t>, after they have come into formation. Player can keep attacking even before they settle into formation.</w:t>
+        <w:t> — Enemies can attack the player (projectiles, beams, after they have come into formation. Player can keep attacking even before they settle into formation.</w:t>
       </w:r>
     </w:p>
     <w:p>
@@ -972,9 +918,624 @@
     <w:p>
       <w:pPr>
         <w:rPr>
-          <w:lang w:val="en-US"/>
-        </w:rPr>
-      </w:pPr>
+          <w:b/>
+          <w:bCs/>
+          <w:sz w:val="40"/>
+          <w:szCs w:val="40"/>
+          <w:lang w:val="en-US"/>
+        </w:rPr>
+      </w:pPr>
+      <w:r>
+        <w:rPr>
+          <w:b/>
+          <w:bCs/>
+          <w:sz w:val="40"/>
+          <w:szCs w:val="40"/>
+          <w:lang w:val="en-US"/>
+        </w:rPr>
+        <w:t>New addition:</w:t>
+      </w:r>
+    </w:p>
+    <w:p>
+      <w:pPr>
+        <w:rPr>
+          <w:lang w:val="en-US"/>
+        </w:rPr>
+      </w:pPr>
+    </w:p>
+    <w:p>
+      <w:pPr>
+        <w:rPr>
+          <w:lang w:val="en-US"/>
+        </w:rPr>
+      </w:pPr>
+      <w:r>
+        <w:rPr>
+          <w:lang w:val="en-US"/>
+        </w:rPr>
+        <w:t>New high-level game rule framework:</w:t>
+      </w:r>
+      <w:r>
+        <w:rPr>
+          <w:lang w:val="en-US"/>
+        </w:rPr>
+        <w:br/>
+      </w:r>
+    </w:p>
+    <w:p>
+      <w:pPr>
+        <w:pStyle w:val="ListParagraph"/>
+        <w:numPr>
+          <w:ilvl w:val="0"/>
+          <w:numId w:val="5"/>
+        </w:numPr>
+        <w:rPr>
+          <w:lang w:val="en-US"/>
+        </w:rPr>
+      </w:pPr>
+      <w:r>
+        <w:rPr>
+          <w:lang w:val="en-US"/>
+        </w:rPr>
+        <w:t>Each enemy has a health bar. As levels or waves progress their health bar depletes a lot slower. 1 wave of enemies will pop in a single hit. Later will take more than 1 hits as waves progresses.</w:t>
+      </w:r>
+    </w:p>
+    <w:p>
+      <w:pPr>
+        <w:pStyle w:val="ListParagraph"/>
+        <w:numPr>
+          <w:ilvl w:val="0"/>
+          <w:numId w:val="5"/>
+        </w:numPr>
+        <w:rPr>
+          <w:lang w:val="en-US"/>
+        </w:rPr>
+      </w:pPr>
+      <w:r>
+        <w:rPr>
+          <w:lang w:val="en-US"/>
+        </w:rPr>
+        <w:t>The game is time bound now. For now, a minute.</w:t>
+      </w:r>
+    </w:p>
+    <w:p>
+      <w:pPr>
+        <w:pStyle w:val="ListParagraph"/>
+        <w:numPr>
+          <w:ilvl w:val="0"/>
+          <w:numId w:val="5"/>
+        </w:numPr>
+        <w:rPr>
+          <w:lang w:val="en-US"/>
+        </w:rPr>
+      </w:pPr>
+      <w:r>
+        <w:rPr>
+          <w:lang w:val="en-US"/>
+        </w:rPr>
+        <w:t>The player gets 3 rounds of life-denoted by heart shape.</w:t>
+      </w:r>
+    </w:p>
+    <w:p>
+      <w:pPr>
+        <w:pStyle w:val="ListParagraph"/>
+        <w:numPr>
+          <w:ilvl w:val="0"/>
+          <w:numId w:val="5"/>
+        </w:numPr>
+        <w:rPr>
+          <w:lang w:val="en-US"/>
+        </w:rPr>
+      </w:pPr>
+      <w:r>
+        <w:rPr>
+          <w:lang w:val="en-US"/>
+        </w:rPr>
+        <w:t>There are two types of upgrades now. One that upgrades ship and other upgrades the turret system/types.</w:t>
+      </w:r>
+    </w:p>
+    <w:p>
+      <w:pPr>
+        <w:pStyle w:val="ListParagraph"/>
+        <w:numPr>
+          <w:ilvl w:val="0"/>
+          <w:numId w:val="5"/>
+        </w:numPr>
+        <w:rPr>
+          <w:lang w:val="en-US"/>
+        </w:rPr>
+      </w:pPr>
+      <w:r>
+        <w:rPr>
+          <w:lang w:val="en-US"/>
+        </w:rPr>
+        <w:t>Each wave gets difficult as density of enemies coming also increases and after 1</w:t>
+      </w:r>
+      <w:r>
+        <w:rPr>
+          <w:vertAlign w:val="superscript"/>
+          <w:lang w:val="en-US"/>
+        </w:rPr>
+        <w:t>st</w:t>
+      </w:r>
+      <w:r>
+        <w:rPr>
+          <w:lang w:val="en-US"/>
+        </w:rPr>
+        <w:t xml:space="preserve"> wave they also start to shoot back. Even density or rate of shoot backs increase with each wave but gets capped after a certain number of waves.</w:t>
+      </w:r>
+    </w:p>
+    <w:p>
+      <w:pPr>
+        <w:pStyle w:val="ListParagraph"/>
+        <w:numPr>
+          <w:ilvl w:val="0"/>
+          <w:numId w:val="5"/>
+        </w:numPr>
+        <w:rPr>
+          <w:lang w:val="en-US"/>
+        </w:rPr>
+      </w:pPr>
+      <w:r>
+        <w:rPr>
+          <w:lang w:val="en-US"/>
+        </w:rPr>
+        <w:t xml:space="preserve">Enemy </w:t>
+      </w:r>
+      <w:r>
+        <w:t xml:space="preserve">find the player's current </w:t>
+      </w:r>
+      <w:r>
+        <w:rPr>
+          <w:rStyle w:val="math-inline"/>
+          <w:rFonts w:ascii="Arial" w:hAnsi="Arial" w:cs="Arial"/>
+        </w:rPr>
+        <w:t>x*y</w:t>
+      </w:r>
+      <w:r>
+        <w:t xml:space="preserve"> position and maintain a distance of 200 pixels</w:t>
+      </w:r>
+      <w:r>
+        <w:t>.</w:t>
+      </w:r>
+    </w:p>
+    <w:p>
+      <w:pPr>
+        <w:pStyle w:val="ListParagraph"/>
+        <w:numPr>
+          <w:ilvl w:val="0"/>
+          <w:numId w:val="5"/>
+        </w:numPr>
+        <w:rPr>
+          <w:lang w:val="en-US"/>
+        </w:rPr>
+      </w:pPr>
+      <w:r>
+        <w:rPr>
+          <w:lang w:val="en-US"/>
+        </w:rPr>
+        <w:t xml:space="preserve">Various entry styles need to be incorporated. - </w:t>
+      </w:r>
+    </w:p>
+    <w:p>
+      <w:pPr>
+        <w:pStyle w:val="ListParagraph"/>
+        <w:numPr>
+          <w:ilvl w:val="1"/>
+          <w:numId w:val="5"/>
+        </w:numPr>
+        <w:rPr>
+          <w:lang w:val="en-US"/>
+        </w:rPr>
+      </w:pPr>
+      <w:r>
+        <w:rPr>
+          <w:lang w:val="en-US"/>
+        </w:rPr>
+        <w:t>vanilla default where they are coming from the top.</w:t>
+      </w:r>
+    </w:p>
+    <w:p>
+      <w:pPr>
+        <w:pStyle w:val="ListParagraph"/>
+        <w:numPr>
+          <w:ilvl w:val="1"/>
+          <w:numId w:val="5"/>
+        </w:numPr>
+        <w:rPr>
+          <w:lang w:val="en-US"/>
+        </w:rPr>
+      </w:pPr>
+      <w:r>
+        <w:t>W</w:t>
+      </w:r>
+      <w:r>
+        <w:t>eaving in a figure-eight pattern</w:t>
+      </w:r>
+      <w:r>
+        <w:t xml:space="preserve"> from both the sides at same time</w:t>
+      </w:r>
+      <w:r>
+        <w:t>.</w:t>
+      </w:r>
+    </w:p>
+    <w:p>
+      <w:pPr>
+        <w:pStyle w:val="ListParagraph"/>
+        <w:numPr>
+          <w:ilvl w:val="1"/>
+          <w:numId w:val="5"/>
+        </w:numPr>
+        <w:rPr>
+          <w:lang w:val="en-US"/>
+        </w:rPr>
+      </w:pPr>
+      <w:r>
+        <w:t xml:space="preserve">Weaving in a figure-eight pattern from </w:t>
+      </w:r>
+      <w:r>
+        <w:t>either</w:t>
+      </w:r>
+      <w:r>
+        <w:t xml:space="preserve"> </w:t>
+      </w:r>
+      <w:r>
+        <w:t xml:space="preserve">of </w:t>
+      </w:r>
+      <w:r>
+        <w:t>the sides</w:t>
+      </w:r>
+      <w:r>
+        <w:t xml:space="preserve"> at once.</w:t>
+      </w:r>
+    </w:p>
+    <w:p>
+      <w:pPr>
+        <w:pStyle w:val="ListParagraph"/>
+        <w:numPr>
+          <w:ilvl w:val="0"/>
+          <w:numId w:val="5"/>
+        </w:numPr>
+        <w:rPr>
+          <w:lang w:val="en-US"/>
+        </w:rPr>
+      </w:pPr>
+      <w:r>
+        <w:rPr>
+          <w:lang w:val="en-US"/>
+        </w:rPr>
+        <w:t>Definition of formation: After the entry of enemies, they may settle into a formation, in which it keeps a constant relative distance with respect to the player’s ship.</w:t>
+      </w:r>
+      <w:r>
+        <w:rPr>
+          <w:lang w:val="en-US"/>
+        </w:rPr>
+        <w:br/>
+        <w:t>But there’s only two types of formation which is V-shaped formation. And rectangular shaped formation, grid pattern.</w:t>
+      </w:r>
+    </w:p>
+    <w:p>
+      <w:pPr>
+        <w:pStyle w:val="ListParagraph"/>
+        <w:numPr>
+          <w:ilvl w:val="0"/>
+          <w:numId w:val="5"/>
+        </w:numPr>
+        <w:rPr>
+          <w:lang w:val="en-US"/>
+        </w:rPr>
+      </w:pPr>
+      <w:r>
+        <w:rPr>
+          <w:lang w:val="en-US"/>
+        </w:rPr>
+        <w:t>Every hit on enemies results in ripple like rainbow colored blurry wave across the screen that stacks if chain of enemies is killed.</w:t>
+      </w:r>
+    </w:p>
+    <w:p>
+      <w:pPr>
+        <w:pStyle w:val="ListParagraph"/>
+        <w:numPr>
+          <w:ilvl w:val="0"/>
+          <w:numId w:val="5"/>
+        </w:numPr>
+        <w:rPr>
+          <w:lang w:val="en-US"/>
+        </w:rPr>
+      </w:pPr>
+      <w:r>
+        <w:rPr>
+          <w:lang w:val="en-US"/>
+        </w:rPr>
+        <w:t>Chain hits stack and points are added. Chain hit points are shown at the top of battle screen space and fades when a streak is broken.</w:t>
+      </w:r>
+    </w:p>
+    <w:p>
+      <w:pPr>
+        <w:pStyle w:val="ListParagraph"/>
+        <w:numPr>
+          <w:ilvl w:val="0"/>
+          <w:numId w:val="5"/>
+        </w:numPr>
+        <w:rPr>
+          <w:lang w:val="en-US"/>
+        </w:rPr>
+      </w:pPr>
+      <w:r>
+        <w:rPr>
+          <w:lang w:val="en-US"/>
+        </w:rPr>
+        <w:t>Also, as the ship is upgraded – color of the ammo changes to neon glowing pink for first upgrade. Turret types and patterns are as follows-</w:t>
+      </w:r>
+    </w:p>
+    <w:p>
+      <w:pPr>
+        <w:pStyle w:val="ListParagraph"/>
+        <w:numPr>
+          <w:ilvl w:val="1"/>
+          <w:numId w:val="5"/>
+        </w:numPr>
+        <w:rPr>
+          <w:lang w:val="en-US"/>
+        </w:rPr>
+      </w:pPr>
+      <w:r>
+        <w:rPr>
+          <w:lang w:val="en-US"/>
+        </w:rPr>
+        <w:t>Turret type- laser</w:t>
+      </w:r>
+    </w:p>
+    <w:p>
+      <w:pPr>
+        <w:pStyle w:val="ListParagraph"/>
+        <w:numPr>
+          <w:ilvl w:val="2"/>
+          <w:numId w:val="5"/>
+        </w:numPr>
+        <w:rPr>
+          <w:lang w:val="en-US"/>
+        </w:rPr>
+      </w:pPr>
+      <w:r>
+        <w:rPr>
+          <w:lang w:val="en-US"/>
+        </w:rPr>
+        <w:t xml:space="preserve">Single turret-Single file </w:t>
+      </w:r>
+      <w:r>
+        <w:rPr>
+          <w:b/>
+          <w:bCs/>
+          <w:lang w:val="en-US"/>
+        </w:rPr>
+        <w:t>(currently implemented)</w:t>
+      </w:r>
+    </w:p>
+    <w:p>
+      <w:pPr>
+        <w:pStyle w:val="ListParagraph"/>
+        <w:numPr>
+          <w:ilvl w:val="2"/>
+          <w:numId w:val="5"/>
+        </w:numPr>
+        <w:rPr>
+          <w:lang w:val="en-US"/>
+        </w:rPr>
+      </w:pPr>
+      <w:r>
+        <w:rPr>
+          <w:lang w:val="en-US"/>
+        </w:rPr>
+        <w:t>Dual turret - Dual file-straight pattern</w:t>
+      </w:r>
+    </w:p>
+    <w:p>
+      <w:pPr>
+        <w:pStyle w:val="ListParagraph"/>
+        <w:numPr>
+          <w:ilvl w:val="2"/>
+          <w:numId w:val="5"/>
+        </w:numPr>
+        <w:rPr>
+          <w:lang w:val="en-US"/>
+        </w:rPr>
+      </w:pPr>
+      <w:r>
+        <w:rPr>
+          <w:lang w:val="en-US"/>
+        </w:rPr>
+        <w:t>Dual turret – S-wave pattern – interweaving</w:t>
+      </w:r>
+    </w:p>
+    <w:p>
+      <w:pPr>
+        <w:pStyle w:val="ListParagraph"/>
+        <w:numPr>
+          <w:ilvl w:val="2"/>
+          <w:numId w:val="5"/>
+        </w:numPr>
+        <w:rPr>
+          <w:lang w:val="en-US"/>
+        </w:rPr>
+      </w:pPr>
+      <w:proofErr w:type="spellStart"/>
+      <w:r>
+        <w:rPr>
+          <w:lang w:val="en-US"/>
+        </w:rPr>
+        <w:t>Tripple</w:t>
+      </w:r>
+      <w:proofErr w:type="spellEnd"/>
+      <w:r>
+        <w:rPr>
+          <w:lang w:val="en-US"/>
+        </w:rPr>
+        <w:t xml:space="preserve"> turret- triangle pattern </w:t>
+      </w:r>
+      <w:r>
+        <w:rPr>
+          <w:b/>
+          <w:bCs/>
+          <w:lang w:val="en-US"/>
+        </w:rPr>
+        <w:t>(currently implemented)</w:t>
+      </w:r>
+    </w:p>
+    <w:p>
+      <w:pPr>
+        <w:pStyle w:val="ListParagraph"/>
+        <w:numPr>
+          <w:ilvl w:val="1"/>
+          <w:numId w:val="5"/>
+        </w:numPr>
+        <w:rPr>
+          <w:lang w:val="en-US"/>
+        </w:rPr>
+      </w:pPr>
+      <w:r>
+        <w:rPr>
+          <w:lang w:val="en-US"/>
+        </w:rPr>
+        <w:t xml:space="preserve">Turret type- </w:t>
+      </w:r>
+      <w:r>
+        <w:rPr>
+          <w:lang w:val="en-US"/>
+        </w:rPr>
+        <w:t xml:space="preserve">Electric shock </w:t>
+      </w:r>
+      <w:r>
+        <w:rPr>
+          <w:b/>
+          <w:bCs/>
+          <w:lang w:val="en-US"/>
+        </w:rPr>
+        <w:t>(currently implemented)</w:t>
+      </w:r>
+    </w:p>
+    <w:p>
+      <w:pPr>
+        <w:pStyle w:val="ListParagraph"/>
+        <w:numPr>
+          <w:ilvl w:val="1"/>
+          <w:numId w:val="5"/>
+        </w:numPr>
+        <w:rPr>
+          <w:lang w:val="en-US"/>
+        </w:rPr>
+      </w:pPr>
+      <w:r>
+        <w:rPr>
+          <w:lang w:val="en-US"/>
+        </w:rPr>
+        <w:t>Turret type</w:t>
+      </w:r>
+      <w:r>
+        <w:rPr>
+          <w:lang w:val="en-US"/>
+        </w:rPr>
+        <w:t xml:space="preserve"> – psionic – ripple of waves that’s concentric </w:t>
+      </w:r>
+      <w:proofErr w:type="gramStart"/>
+      <w:r>
+        <w:rPr>
+          <w:lang w:val="en-US"/>
+        </w:rPr>
+        <w:t>arcs(</w:t>
+      </w:r>
+      <w:proofErr w:type="gramEnd"/>
+      <w:r>
+        <w:rPr>
+          <w:lang w:val="en-US"/>
+        </w:rPr>
+        <w:t xml:space="preserve">that looks like a </w:t>
+      </w:r>
+      <w:proofErr w:type="spellStart"/>
+      <w:r>
+        <w:rPr>
+          <w:lang w:val="en-US"/>
+        </w:rPr>
+        <w:t>wifi</w:t>
+      </w:r>
+      <w:proofErr w:type="spellEnd"/>
+      <w:r>
+        <w:rPr>
+          <w:lang w:val="en-US"/>
+        </w:rPr>
+        <w:t xml:space="preserve"> icon) – it scrambles the enemy waves into crashing each other. This can be used only once and then revert to the previous turret type that was being used.  </w:t>
+      </w:r>
+    </w:p>
+    <w:p>
+      <w:pPr>
+        <w:pStyle w:val="ListParagraph"/>
+        <w:numPr>
+          <w:ilvl w:val="0"/>
+          <w:numId w:val="5"/>
+        </w:numPr>
+        <w:rPr>
+          <w:lang w:val="en-US"/>
+        </w:rPr>
+      </w:pPr>
+      <w:r>
+        <w:rPr>
+          <w:lang w:val="en-US"/>
+        </w:rPr>
+        <w:lastRenderedPageBreak/>
+        <w:t>upgrades are nerfed to only one drop per wave or until the player consumes or uses it once. Each wave lasts for a minute.</w:t>
+      </w:r>
+    </w:p>
+    <w:p>
+      <w:pPr>
+        <w:pStyle w:val="ListParagraph"/>
+        <w:numPr>
+          <w:ilvl w:val="0"/>
+          <w:numId w:val="5"/>
+        </w:numPr>
+        <w:rPr>
+          <w:lang w:val="en-US"/>
+        </w:rPr>
+      </w:pPr>
+      <w:r>
+        <w:rPr>
+          <w:lang w:val="en-US"/>
+        </w:rPr>
+        <w:t xml:space="preserve">There is a different upgrade-asset drop </w:t>
+      </w:r>
+      <w:proofErr w:type="spellStart"/>
+      <w:r>
+        <w:rPr>
+          <w:lang w:val="en-US"/>
+        </w:rPr>
+        <w:t>png</w:t>
+      </w:r>
+      <w:proofErr w:type="spellEnd"/>
+      <w:r>
+        <w:rPr>
+          <w:lang w:val="en-US"/>
+        </w:rPr>
+        <w:t xml:space="preserve"> for upgrades of turret types and patterns. It will be the single icon or </w:t>
+      </w:r>
+      <w:proofErr w:type="spellStart"/>
+      <w:r>
+        <w:rPr>
+          <w:lang w:val="en-US"/>
+        </w:rPr>
+        <w:t>png</w:t>
+      </w:r>
+      <w:proofErr w:type="spellEnd"/>
+      <w:r>
+        <w:rPr>
+          <w:lang w:val="en-US"/>
+        </w:rPr>
+        <w:t>. But round robin turrets and patterns will be implemented based on the progression of waves. Even this drop will be once per wave after it gets consumed.</w:t>
+      </w:r>
+      <w:r>
+        <w:rPr>
+          <w:lang w:val="en-US"/>
+        </w:rPr>
+        <w:br/>
+      </w:r>
     </w:p>
     <w:sectPr>
       <w:pgSz w:w="11906" w:h="16838"/>
@@ -989,6 +1550,95 @@
 <file path=word/numbering.xml><?xml version="1.0" encoding="utf-8"?>
 <w:numbering xmlns:wpc="http://schemas.microsoft.com/office/word/2010/wordprocessingCanvas" xmlns:cx="http://schemas.microsoft.com/office/drawing/2014/chartex" xmlns:cx1="http://schemas.microsoft.com/office/drawing/2015/9/8/chartex" xmlns:cx2="http://schemas.microsoft.com/office/drawing/2015/10/21/chartex" xmlns:cx3="http://schemas.microsoft.com/office/drawing/2016/5/9/chartex" xmlns:cx4="http://schemas.microsoft.com/office/drawing/2016/5/10/chartex" xmlns:cx5="http://schemas.microsoft.com/office/drawing/2016/5/11/chartex" xmlns:cx6="http://schemas.microsoft.com/office/drawing/2016/5/12/chartex" xmlns:cx7="http://schemas.microsoft.com/office/drawing/2016/5/13/chartex" xmlns:cx8="http://schemas.microsoft.com/office/drawing/2016/5/14/chartex" xmlns:mc="http://schemas.openxmlformats.org/markup-compatibility/2006" xmlns:aink="http://schemas.microsoft.com/office/drawing/2016/ink" xmlns:am3d="http://schemas.microsoft.com/office/drawing/2017/model3d" xmlns:o="urn:schemas-microsoft-com:office:office" xmlns:oel="http://schemas.microsoft.com/office/2019/extlst" xmlns:r="http://schemas.openxmlformats.org/officeDocument/2006/relationships" xmlns:m="http://schemas.openxmlformats.org/officeDocument/2006/math" xmlns:v="urn:schemas-microsoft-com:vml" xmlns:wp14="http://schemas.microsoft.com/office/word/2010/wordprocessingDrawing" xmlns:wp="http://schemas.openxmlformats.org/drawingml/2006/wordprocessingDrawing" xmlns:w10="urn:schemas-microsoft-com:office:word" xmlns:w="http://schemas.openxmlformats.org/wordprocessingml/2006/main" xmlns:w14="http://schemas.microsoft.com/office/word/2010/wordml" xmlns:w15="http://schemas.microsoft.com/office/word/2012/wordml" xmlns:w16cex="http://schemas.microsoft.com/office/word/2018/wordml/cex" xmlns:w16cid="http://schemas.microsoft.com/office/word/2016/wordml/cid" xmlns:w16="http://schemas.microsoft.com/office/word/2018/wordml" xmlns:w16sdtdh="http://schemas.microsoft.com/office/word/2020/wordml/sdtdatahash" xmlns:w16se="http://schemas.microsoft.com/office/word/2015/wordml/symex" xmlns:wpg="http://schemas.microsoft.com/office/word/2010/wordprocessingGroup" xmlns:wpi="http://schemas.microsoft.com/office/word/2010/wordprocessingInk" xmlns:wne="http://schemas.microsoft.com/office/word/2006/wordml" xmlns:wps="http://schemas.microsoft.com/office/word/2010/wordprocessingShape" mc:Ignorable="w14 w15 w16se w16cid w16 w16cex w16sdtdh wp14">
   <w:abstractNum w:abstractNumId="0" w15:restartNumberingAfterBreak="0">
+    <w:nsid w:val="06D140FE"/>
+    <w:multiLevelType w:val="hybridMultilevel"/>
+    <w:tmpl w:val="B832E800"/>
+    <w:lvl w:ilvl="0" w:tplc="0809000F">
+      <w:start w:val="1"/>
+      <w:numFmt w:val="decimal"/>
+      <w:lvlText w:val="%1."/>
+      <w:lvlJc w:val="left"/>
+      <w:pPr>
+        <w:ind w:left="720" w:hanging="360"/>
+      </w:pPr>
+      <w:rPr>
+        <w:rFonts w:hint="default"/>
+      </w:rPr>
+    </w:lvl>
+    <w:lvl w:ilvl="1" w:tplc="08090019" w:tentative="1">
+      <w:start w:val="1"/>
+      <w:numFmt w:val="lowerLetter"/>
+      <w:lvlText w:val="%2."/>
+      <w:lvlJc w:val="left"/>
+      <w:pPr>
+        <w:ind w:left="1440" w:hanging="360"/>
+      </w:pPr>
+    </w:lvl>
+    <w:lvl w:ilvl="2" w:tplc="0809001B" w:tentative="1">
+      <w:start w:val="1"/>
+      <w:numFmt w:val="lowerRoman"/>
+      <w:lvlText w:val="%3."/>
+      <w:lvlJc w:val="right"/>
+      <w:pPr>
+        <w:ind w:left="2160" w:hanging="180"/>
+      </w:pPr>
+    </w:lvl>
+    <w:lvl w:ilvl="3" w:tplc="0809000F" w:tentative="1">
+      <w:start w:val="1"/>
+      <w:numFmt w:val="decimal"/>
+      <w:lvlText w:val="%4."/>
+      <w:lvlJc w:val="left"/>
+      <w:pPr>
+        <w:ind w:left="2880" w:hanging="360"/>
+      </w:pPr>
+    </w:lvl>
+    <w:lvl w:ilvl="4" w:tplc="08090019" w:tentative="1">
+      <w:start w:val="1"/>
+      <w:numFmt w:val="lowerLetter"/>
+      <w:lvlText w:val="%5."/>
+      <w:lvlJc w:val="left"/>
+      <w:pPr>
+        <w:ind w:left="3600" w:hanging="360"/>
+      </w:pPr>
+    </w:lvl>
+    <w:lvl w:ilvl="5" w:tplc="0809001B" w:tentative="1">
+      <w:start w:val="1"/>
+      <w:numFmt w:val="lowerRoman"/>
+      <w:lvlText w:val="%6."/>
+      <w:lvlJc w:val="right"/>
+      <w:pPr>
+        <w:ind w:left="4320" w:hanging="180"/>
+      </w:pPr>
+    </w:lvl>
+    <w:lvl w:ilvl="6" w:tplc="0809000F" w:tentative="1">
+      <w:start w:val="1"/>
+      <w:numFmt w:val="decimal"/>
+      <w:lvlText w:val="%7."/>
+      <w:lvlJc w:val="left"/>
+      <w:pPr>
+        <w:ind w:left="5040" w:hanging="360"/>
+      </w:pPr>
+    </w:lvl>
+    <w:lvl w:ilvl="7" w:tplc="08090019" w:tentative="1">
+      <w:start w:val="1"/>
+      <w:numFmt w:val="lowerLetter"/>
+      <w:lvlText w:val="%8."/>
+      <w:lvlJc w:val="left"/>
+      <w:pPr>
+        <w:ind w:left="5760" w:hanging="360"/>
+      </w:pPr>
+    </w:lvl>
+    <w:lvl w:ilvl="8" w:tplc="0809001B" w:tentative="1">
+      <w:start w:val="1"/>
+      <w:numFmt w:val="lowerRoman"/>
+      <w:lvlText w:val="%9."/>
+      <w:lvlJc w:val="right"/>
+      <w:pPr>
+        <w:ind w:left="6480" w:hanging="180"/>
+      </w:pPr>
+    </w:lvl>
+  </w:abstractNum>
+  <w:abstractNum w:abstractNumId="1" w15:restartNumberingAfterBreak="0">
     <w:nsid w:val="136660AC"/>
     <w:multiLevelType w:val="hybridMultilevel"/>
     <w:tmpl w:val="746CBDF0"/>
@@ -1077,7 +1727,185 @@
       </w:pPr>
     </w:lvl>
   </w:abstractNum>
-  <w:abstractNum w:abstractNumId="1" w15:restartNumberingAfterBreak="0">
+  <w:abstractNum w:abstractNumId="2" w15:restartNumberingAfterBreak="0">
+    <w:nsid w:val="230F2C91"/>
+    <w:multiLevelType w:val="hybridMultilevel"/>
+    <w:tmpl w:val="AF62E1C2"/>
+    <w:lvl w:ilvl="0" w:tplc="0809000F">
+      <w:start w:val="1"/>
+      <w:numFmt w:val="decimal"/>
+      <w:lvlText w:val="%1."/>
+      <w:lvlJc w:val="left"/>
+      <w:pPr>
+        <w:ind w:left="720" w:hanging="360"/>
+      </w:pPr>
+      <w:rPr>
+        <w:rFonts w:hint="default"/>
+      </w:rPr>
+    </w:lvl>
+    <w:lvl w:ilvl="1" w:tplc="08090019">
+      <w:start w:val="1"/>
+      <w:numFmt w:val="lowerLetter"/>
+      <w:lvlText w:val="%2."/>
+      <w:lvlJc w:val="left"/>
+      <w:pPr>
+        <w:ind w:left="1440" w:hanging="360"/>
+      </w:pPr>
+    </w:lvl>
+    <w:lvl w:ilvl="2" w:tplc="0809001B">
+      <w:start w:val="1"/>
+      <w:numFmt w:val="lowerRoman"/>
+      <w:lvlText w:val="%3."/>
+      <w:lvlJc w:val="right"/>
+      <w:pPr>
+        <w:ind w:left="2160" w:hanging="180"/>
+      </w:pPr>
+    </w:lvl>
+    <w:lvl w:ilvl="3" w:tplc="0809000F" w:tentative="1">
+      <w:start w:val="1"/>
+      <w:numFmt w:val="decimal"/>
+      <w:lvlText w:val="%4."/>
+      <w:lvlJc w:val="left"/>
+      <w:pPr>
+        <w:ind w:left="2880" w:hanging="360"/>
+      </w:pPr>
+    </w:lvl>
+    <w:lvl w:ilvl="4" w:tplc="08090019" w:tentative="1">
+      <w:start w:val="1"/>
+      <w:numFmt w:val="lowerLetter"/>
+      <w:lvlText w:val="%5."/>
+      <w:lvlJc w:val="left"/>
+      <w:pPr>
+        <w:ind w:left="3600" w:hanging="360"/>
+      </w:pPr>
+    </w:lvl>
+    <w:lvl w:ilvl="5" w:tplc="0809001B" w:tentative="1">
+      <w:start w:val="1"/>
+      <w:numFmt w:val="lowerRoman"/>
+      <w:lvlText w:val="%6."/>
+      <w:lvlJc w:val="right"/>
+      <w:pPr>
+        <w:ind w:left="4320" w:hanging="180"/>
+      </w:pPr>
+    </w:lvl>
+    <w:lvl w:ilvl="6" w:tplc="0809000F" w:tentative="1">
+      <w:start w:val="1"/>
+      <w:numFmt w:val="decimal"/>
+      <w:lvlText w:val="%7."/>
+      <w:lvlJc w:val="left"/>
+      <w:pPr>
+        <w:ind w:left="5040" w:hanging="360"/>
+      </w:pPr>
+    </w:lvl>
+    <w:lvl w:ilvl="7" w:tplc="08090019" w:tentative="1">
+      <w:start w:val="1"/>
+      <w:numFmt w:val="lowerLetter"/>
+      <w:lvlText w:val="%8."/>
+      <w:lvlJc w:val="left"/>
+      <w:pPr>
+        <w:ind w:left="5760" w:hanging="360"/>
+      </w:pPr>
+    </w:lvl>
+    <w:lvl w:ilvl="8" w:tplc="0809001B" w:tentative="1">
+      <w:start w:val="1"/>
+      <w:numFmt w:val="lowerRoman"/>
+      <w:lvlText w:val="%9."/>
+      <w:lvlJc w:val="right"/>
+      <w:pPr>
+        <w:ind w:left="6480" w:hanging="180"/>
+      </w:pPr>
+    </w:lvl>
+  </w:abstractNum>
+  <w:abstractNum w:abstractNumId="3" w15:restartNumberingAfterBreak="0">
+    <w:nsid w:val="3EB02EDF"/>
+    <w:multiLevelType w:val="hybridMultilevel"/>
+    <w:tmpl w:val="601EDC0A"/>
+    <w:lvl w:ilvl="0" w:tplc="0809000F">
+      <w:start w:val="1"/>
+      <w:numFmt w:val="decimal"/>
+      <w:lvlText w:val="%1."/>
+      <w:lvlJc w:val="left"/>
+      <w:pPr>
+        <w:ind w:left="720" w:hanging="360"/>
+      </w:pPr>
+      <w:rPr>
+        <w:rFonts w:hint="default"/>
+      </w:rPr>
+    </w:lvl>
+    <w:lvl w:ilvl="1" w:tplc="08090019" w:tentative="1">
+      <w:start w:val="1"/>
+      <w:numFmt w:val="lowerLetter"/>
+      <w:lvlText w:val="%2."/>
+      <w:lvlJc w:val="left"/>
+      <w:pPr>
+        <w:ind w:left="1440" w:hanging="360"/>
+      </w:pPr>
+    </w:lvl>
+    <w:lvl w:ilvl="2" w:tplc="0809001B" w:tentative="1">
+      <w:start w:val="1"/>
+      <w:numFmt w:val="lowerRoman"/>
+      <w:lvlText w:val="%3."/>
+      <w:lvlJc w:val="right"/>
+      <w:pPr>
+        <w:ind w:left="2160" w:hanging="180"/>
+      </w:pPr>
+    </w:lvl>
+    <w:lvl w:ilvl="3" w:tplc="0809000F" w:tentative="1">
+      <w:start w:val="1"/>
+      <w:numFmt w:val="decimal"/>
+      <w:lvlText w:val="%4."/>
+      <w:lvlJc w:val="left"/>
+      <w:pPr>
+        <w:ind w:left="2880" w:hanging="360"/>
+      </w:pPr>
+    </w:lvl>
+    <w:lvl w:ilvl="4" w:tplc="08090019" w:tentative="1">
+      <w:start w:val="1"/>
+      <w:numFmt w:val="lowerLetter"/>
+      <w:lvlText w:val="%5."/>
+      <w:lvlJc w:val="left"/>
+      <w:pPr>
+        <w:ind w:left="3600" w:hanging="360"/>
+      </w:pPr>
+    </w:lvl>
+    <w:lvl w:ilvl="5" w:tplc="0809001B" w:tentative="1">
+      <w:start w:val="1"/>
+      <w:numFmt w:val="lowerRoman"/>
+      <w:lvlText w:val="%6."/>
+      <w:lvlJc w:val="right"/>
+      <w:pPr>
+        <w:ind w:left="4320" w:hanging="180"/>
+      </w:pPr>
+    </w:lvl>
+    <w:lvl w:ilvl="6" w:tplc="0809000F" w:tentative="1">
+      <w:start w:val="1"/>
+      <w:numFmt w:val="decimal"/>
+      <w:lvlText w:val="%7."/>
+      <w:lvlJc w:val="left"/>
+      <w:pPr>
+        <w:ind w:left="5040" w:hanging="360"/>
+      </w:pPr>
+    </w:lvl>
+    <w:lvl w:ilvl="7" w:tplc="08090019" w:tentative="1">
+      <w:start w:val="1"/>
+      <w:numFmt w:val="lowerLetter"/>
+      <w:lvlText w:val="%8."/>
+      <w:lvlJc w:val="left"/>
+      <w:pPr>
+        <w:ind w:left="5760" w:hanging="360"/>
+      </w:pPr>
+    </w:lvl>
+    <w:lvl w:ilvl="8" w:tplc="0809001B" w:tentative="1">
+      <w:start w:val="1"/>
+      <w:numFmt w:val="lowerRoman"/>
+      <w:lvlText w:val="%9."/>
+      <w:lvlJc w:val="right"/>
+      <w:pPr>
+        <w:ind w:left="6480" w:hanging="180"/>
+      </w:pPr>
+    </w:lvl>
+  </w:abstractNum>
+  <w:abstractNum w:abstractNumId="4" w15:restartNumberingAfterBreak="0">
     <w:nsid w:val="4BE71703"/>
     <w:multiLevelType w:val="multilevel"/>
     <w:tmpl w:val="065AE710"/>
@@ -1191,10 +2019,19 @@
     </w:lvl>
   </w:abstractNum>
   <w:num w:numId="1" w16cid:durableId="1751466562">
+    <w:abstractNumId w:val="4"/>
+  </w:num>
+  <w:num w:numId="2" w16cid:durableId="975450016">
     <w:abstractNumId w:val="1"/>
   </w:num>
-  <w:num w:numId="2" w16cid:durableId="975450016">
+  <w:num w:numId="3" w16cid:durableId="168562482">
+    <w:abstractNumId w:val="3"/>
+  </w:num>
+  <w:num w:numId="4" w16cid:durableId="1154642019">
     <w:abstractNumId w:val="0"/>
+  </w:num>
+  <w:num w:numId="5" w16cid:durableId="1996374445">
+    <w:abstractNumId w:val="2"/>
   </w:num>
 </w:numbering>
 </file>
@@ -1676,6 +2513,11 @@
       <w:contextualSpacing/>
     </w:pPr>
   </w:style>
+  <w:style w:type="character" w:customStyle="1" w:styleId="math-inline">
+    <w:name w:val="math-inline"/>
+    <w:basedOn w:val="DefaultParagraphFont"/>
+    <w:rsid w:val="00DA47B6"/>
+  </w:style>
 </w:styles>
 </file>
 

</xml_diff>